<commit_message>
Keep the salary line at the 55–60 range already given to NIBE.
She asked first and they turned the question back. The visit script now repeats that range instead of opening at 52,000.

Co-authored-by: nurpercn <nurpercn@users.noreply.github.com>
</commit_message>
<xml_diff>
--- a/applications/nibe/NIBE_Hazirlik.docx
+++ b/applications/nibe/NIBE_Hazirlik.docx
@@ -103,7 +103,7 @@
           <w:i w:val="0"/>
           <w:sz w:val="22"/>
         </w:rPr>
-        <w:t>If they ask for a number, say 52,000 SEK gross per month. Do not open salary yourself. Do not sign anything on the day.</w:t>
+        <w:t>You already gave 55,000–60,000 SEK gross per month. You asked; they did not answer and asked you. Do not open it again. If they return to it, repeat that range. Do not drop to a lower number in the room. Do not sign anything on the day.</w:t>
       </w:r>
     </w:p>
     <w:p>
@@ -3275,7 +3275,7 @@
           <w:i w:val="0"/>
           <w:sz w:val="22"/>
         </w:rPr>
-        <w:t>A: Around 52,000 kronor gross per month, depending on the full package — pension, relocation support, and how the work permit is handled. I am flexible on the mix. The overall terms have to make the move to Markaryd sustainable.</w:t>
+        <w:t>A: When we spoke earlier I gave a range of 55 to 60 thousand kronor gross per month. That still stands. It depends on the full package — pension, relocation support, and how the work permit is handled.</w:t>
       </w:r>
     </w:p>
     <w:p>
@@ -3290,7 +3290,7 @@
           <w:color w:val="5C4A1F"/>
           <w:sz w:val="20"/>
         </w:rPr>
-        <w:t>Do not raise salary yourself. Engineers and the hiring manager usually will not. If Madeleine, or anyone, asks “what are your expectations?”, use the sentence above. One number. If they speak first, write their number down and do not accept or refuse it in the room: “Thank you. I would like a day to look at the full package. Please send the terms in writing.” Do not go below 48,000. 50,000 is the floor you can live with in the conversation. 48 to 49 means you ask them up toward 51–52. No signature on the day. No resignation arithmetic: you have already left.</w:t>
+        <w:t>You already opened this. They did not give their number; they asked you, and you said 55–60. Do not raise it again on this visit. Do not apologise for having asked. If they bring it back, repeat the same range. Do not replace it with 52 or any figure under 55 while you are in the room. A lower number now is you bargaining against what you already said.</w:t>
       </w:r>
     </w:p>
     <w:p>
@@ -3305,7 +3305,22 @@
           <w:color w:val="5C4A1F"/>
           <w:sz w:val="20"/>
         </w:rPr>
-        <w:t>If they offer a range and ask you to react, you may say the 52,000 figure sits in or above their range. You still wait for the written package: tillsvidare, probation of at most six months, relocation in writing, who runs the permit and who pays the fee.</w:t>
+        <w:t>If they name a figure: write it down. Do not accept or refuse it there. “Thank you. That sits against the range I already shared, 55 to 60. I would like a day to look at the full package. Please send the terms in writing.” Under 55, that sentence is enough. You can decide at home, on the written offer, whether relocation changes the picture. No signature on the day.</w:t>
+      </w:r>
+    </w:p>
+    <w:p>
+      <w:pPr>
+        <w:spacing w:before="40" w:after="160" w:line="259" w:lineRule="auto"/>
+      </w:pPr>
+      <w:r>
+        <w:rPr>
+          <w:rFonts w:ascii="Calibri" w:hAnsi="Calibri" w:eastAsia="Calibri"/>
+          <w:b w:val="0"/>
+          <w:i/>
+          <w:color w:val="5C4A1F"/>
+          <w:sz w:val="20"/>
+        </w:rPr>
+        <w:t>Written package still has to show: tillsvidare, probation of at most six months, relocation in writing, who runs the permit and who pays the fee.</w:t>
       </w:r>
     </w:p>
     <w:p>
@@ -3840,7 +3855,7 @@
                 <w:i w:val="0"/>
                 <w:sz w:val="18"/>
               </w:rPr>
-              <w:t>Salary, only if asked</w:t>
+              <w:t>Salary, already said</w:t>
             </w:r>
           </w:p>
         </w:tc>
@@ -3856,7 +3871,7 @@
                 <w:i w:val="0"/>
                 <w:sz w:val="18"/>
               </w:rPr>
-              <w:t>52,000 SEK gross/month. Floor you will say: 50. Do not accept under 48.</w:t>
+              <w:t>You asked. They asked you back. You said 55–60,000 SEK gross/month.</w:t>
             </w:r>
           </w:p>
         </w:tc>
@@ -3872,7 +3887,7 @@
                 <w:i w:val="0"/>
                 <w:sz w:val="18"/>
               </w:rPr>
-              <w:t>Then: send it in writing. No signature today.</w:t>
+              <w:t>Repeat that range. Do not say 52 in the room. Writing comes home with you.</w:t>
             </w:r>
           </w:p>
         </w:tc>

</xml_diff>